<commit_message>
Peer review: add July revision addendum; label Figure 2 curves as pinned elastica
- Review (md + docx): addendum listing the Priority 1 textual blockers resolved
  since the reviewed snapshot and the external validation still outstanding.
- sr_geodesics_v1.py docstring: the precomputed curves are pinned Euler-elastica
  candidates (Maxwell clock 4K), not free SR geodesic projections (2K).
</commit_message>
<xml_diff>
--- a/research/geometry-of-seeing-peer-review-2026-07.docx
+++ b/research/geometry-of-seeing-peer-review-2026-07.docx
@@ -206,6 +206,219 @@
           <w:sz w:val="22"/>
         </w:rPr>
         <w:t>Major revision before scholarly publication</w:t>
+      </w:r>
+    </w:p>
+    <w:p>
+      <w:pPr>
+        <w:pStyle w:val="Heading1"/>
+      </w:pPr>
+      <w:r>
+        <w:rPr>
+          <w:rFonts w:ascii="Calibri" w:hAnsi="Calibri"/>
+          <w:sz w:val="32"/>
+        </w:rPr>
+        <w:t>Revision addendum — 17 July 2026</w:t>
+      </w:r>
+    </w:p>
+    <w:p>
+      <w:r>
+        <w:rPr>
+          <w:rFonts w:ascii="Calibri" w:hAnsi="Calibri"/>
+          <w:sz w:val="22"/>
+        </w:rPr>
+        <w:t>The repository has now addressed the principal text- and code-level blockers identified in this report:</w:t>
+      </w:r>
+    </w:p>
+    <w:p>
+      <w:pPr>
+        <w:pStyle w:val="ListBullet"/>
+      </w:pPr>
+      <w:r>
+        <w:rPr>
+          <w:rFonts w:ascii="Calibri" w:hAnsi="Calibri"/>
+          <w:sz w:val="22"/>
+        </w:rPr>
+        <w:t>the project page, posts, captions, comments, and generator now distinguish pinned</w:t>
+      </w:r>
+    </w:p>
+    <w:p>
+      <w:r>
+        <w:rPr>
+          <w:rFonts w:ascii="Calibri" w:hAnsi="Calibri"/>
+          <w:sz w:val="22"/>
+        </w:rPr>
+        <w:t xml:space="preserve">  Euler elastica from free SR geodesics;</w:t>
+      </w:r>
+    </w:p>
+    <w:p>
+      <w:pPr>
+        <w:pStyle w:val="ListBullet"/>
+      </w:pPr>
+      <w:r>
+        <w:rPr>
+          <w:rFonts w:ascii="Calibri" w:hAnsi="Calibri"/>
+          <w:sz w:val="22"/>
+        </w:rPr>
+        <w:t>the V1 state space is stated as $\mathbb R^2\times\mathbb P^1$, with SE(2) used as</w:t>
+      </w:r>
+    </w:p>
+    <w:p>
+      <w:r>
+        <w:rPr>
+          <w:rFonts w:ascii="Calibri" w:hAnsi="Calibri"/>
+          <w:sz w:val="22"/>
+        </w:rPr>
+        <w:t xml:space="preserve">  its oriented double cover and quotient-sensitive endpoint claims flagged;</w:t>
+      </w:r>
+    </w:p>
+    <w:p>
+      <w:pPr>
+        <w:pStyle w:val="ListBullet"/>
+      </w:pPr>
+      <w:r>
+        <w:rPr>
+          <w:rFonts w:ascii="Calibri" w:hAnsi="Calibri"/>
+          <w:sz w:val="22"/>
+        </w:rPr>
+        <w:t>Part 4 no longer presents abnormal or separatrix seams as unresolved parts of the</w:t>
+      </w:r>
+    </w:p>
+    <w:p>
+      <w:r>
+        <w:rPr>
+          <w:rFonts w:ascii="Calibri" w:hAnsi="Calibri"/>
+          <w:sz w:val="22"/>
+        </w:rPr>
+        <w:t xml:space="preserve">  completed SE(2) synthesis;</w:t>
+      </w:r>
+    </w:p>
+    <w:p>
+      <w:pPr>
+        <w:pStyle w:val="ListBullet"/>
+      </w:pPr>
+      <w:r>
+        <w:rPr>
+          <w:rFonts w:ascii="Calibri" w:hAnsi="Calibri"/>
+          <w:sz w:val="22"/>
+        </w:rPr>
+        <w:t>the open Maxwell question is narrowed to a request for sufficient hypotheses rather</w:t>
+      </w:r>
+    </w:p>
+    <w:p>
+      <w:r>
+        <w:rPr>
+          <w:rFonts w:ascii="Calibri" w:hAnsi="Calibri"/>
+          <w:sz w:val="22"/>
+        </w:rPr>
+        <w:t xml:space="preserve">  than stated as a universal law;</w:t>
+      </w:r>
+    </w:p>
+    <w:p>
+      <w:pPr>
+        <w:pStyle w:val="ListBullet"/>
+      </w:pPr>
+      <w:r>
+        <w:rPr>
+          <w:rFonts w:ascii="Calibri" w:hAnsi="Calibri"/>
+          <w:sz w:val="22"/>
+        </w:rPr>
+        <w:t>the magnetic article uses a consistent Lorentz-force sign convention and now includes</w:t>
+      </w:r>
+    </w:p>
+    <w:p>
+      <w:r>
+        <w:rPr>
+          <w:rFonts w:ascii="Calibri" w:hAnsi="Calibri"/>
+          <w:sz w:val="22"/>
+        </w:rPr>
+        <w:t xml:space="preserve">  a worked Martinet bracket example;</w:t>
+      </w:r>
+    </w:p>
+    <w:p>
+      <w:pPr>
+        <w:pStyle w:val="ListBullet"/>
+      </w:pPr>
+      <w:r>
+        <w:rPr>
+          <w:rFonts w:ascii="Calibri" w:hAnsi="Calibri"/>
+          <w:sz w:val="22"/>
+        </w:rPr>
+        <w:t>the false curve-closure, infinite-total-curvature, and Euler-spiral statements were</w:t>
+      </w:r>
+    </w:p>
+    <w:p>
+      <w:r>
+        <w:rPr>
+          <w:rFonts w:ascii="Calibri" w:hAnsi="Calibri"/>
+          <w:sz w:val="22"/>
+        </w:rPr>
+        <w:t xml:space="preserve">  corrected;</w:t>
+      </w:r>
+    </w:p>
+    <w:p>
+      <w:pPr>
+        <w:pStyle w:val="ListBullet"/>
+      </w:pPr>
+      <w:r>
+        <w:rPr>
+          <w:rFonts w:ascii="Calibri" w:hAnsi="Calibri"/>
+          <w:sz w:val="22"/>
+        </w:rPr>
+        <w:t>Appendix A5's mirror-pair sample code was repaired: the previous phase parameter was</w:t>
+      </w:r>
+    </w:p>
+    <w:p>
+      <w:r>
+        <w:rPr>
+          <w:rFonts w:ascii="Calibri" w:hAnsi="Calibri"/>
+          <w:sz w:val="22"/>
+        </w:rPr>
+        <w:t xml:space="preserve">  unused and generated the same curve twice;</w:t>
+      </w:r>
+    </w:p>
+    <w:p>
+      <w:pPr>
+        <w:pStyle w:val="ListBullet"/>
+      </w:pPr>
+      <w:r>
+        <w:rPr>
+          <w:rFonts w:ascii="Calibri" w:hAnsi="Calibri"/>
+          <w:sz w:val="22"/>
+        </w:rPr>
+        <w:t>Appendices A1–A2 now include concrete explanations of algebra element versus vector</w:t>
+      </w:r>
+    </w:p>
+    <w:p>
+      <w:r>
+        <w:rPr>
+          <w:rFonts w:ascii="Calibri" w:hAnsi="Calibri"/>
+          <w:sz w:val="22"/>
+        </w:rPr>
+        <w:t xml:space="preserve">  field versus trajectory, matrix brackets, coadjoint “prices,” and the change from contact growth $(2,3)$ to Martinet growth $(2,2,3)$.</w:t>
+      </w:r>
+    </w:p>
+    <w:p>
+      <w:r>
+        <w:rPr>
+          <w:rFonts w:ascii="Calibri" w:hAnsi="Calibri"/>
+          <w:sz w:val="22"/>
+        </w:rPr>
+        <w:t xml:space="preserve">The recommendation remains </w:t>
+      </w:r>
+      <w:r>
+        <w:rPr>
+          <w:rFonts w:ascii="Calibri" w:hAnsi="Calibri"/>
+          <w:b/>
+          <w:sz w:val="22"/>
+        </w:rPr>
+        <w:t>major revision</w:t>
+      </w:r>
+      <w:r>
+        <w:rPr>
+          <w:rFonts w:ascii="Calibri" w:hAnsi="Calibri"/>
+          <w:sz w:val="22"/>
+        </w:rPr>
+        <w:t xml:space="preserve"> as a record of the reviewed snapshot, but the listed Priority 1 textual blockers are resolved in the working tree. Remaining work is principally external scholarly validation: exact source-level theorem cross-references, independent line-by-line mathematical review, and—before any astrophysics-journal claim— blind observational benchmarks with uncertainty propagation.</w:t>
       </w:r>
     </w:p>
     <w:p>

</xml_diff>